<commit_message>
Fix font, align error
</commit_message>
<xml_diff>
--- a/backend/Sample.docx
+++ b/backend/Sample.docx
@@ -42,13 +42,13 @@
     <w:tbl>
       <w:tblPr>
         <w:tblStyle w:val="TableGrid"/>
-        <w:tblW w:w="0" w:type="auto"/>
+        <w:tblW w:w="5000" w:type="pct"/>
         <w:tblLook w:val="04A0" w:firstRow="1" w:lastRow="0" w:firstColumn="1" w:lastColumn="0" w:noHBand="0" w:noVBand="1"/>
       </w:tblPr>
       <w:tblGrid>
-        <w:gridCol w:w="704"/>
-        <w:gridCol w:w="7655"/>
-        <w:gridCol w:w="2097"/>
+        <w:gridCol w:w="1037"/>
+        <w:gridCol w:w="9873"/>
+        <w:gridCol w:w="4478"/>
       </w:tblGrid>
       <w:tr>
         <w:trPr>
@@ -56,7 +56,7 @@
         </w:trPr>
         <w:tc>
           <w:tcPr>
-            <w:tcW w:w="704" w:type="dxa"/>
+            <w:tcW w:w="337" w:type="pct"/>
             <w:vAlign w:val="center"/>
           </w:tcPr>
           <w:p>
@@ -84,7 +84,7 @@
         </w:tc>
         <w:tc>
           <w:tcPr>
-            <w:tcW w:w="7655" w:type="dxa"/>
+            <w:tcW w:w="3208" w:type="pct"/>
             <w:vAlign w:val="center"/>
           </w:tcPr>
           <w:p>
@@ -112,7 +112,7 @@
         </w:tc>
         <w:tc>
           <w:tcPr>
-            <w:tcW w:w="2097" w:type="dxa"/>
+            <w:tcW w:w="1455" w:type="pct"/>
             <w:vAlign w:val="center"/>
           </w:tcPr>
           <w:p>
@@ -145,7 +145,7 @@
         </w:trPr>
         <w:tc>
           <w:tcPr>
-            <w:tcW w:w="704" w:type="dxa"/>
+            <w:tcW w:w="337" w:type="pct"/>
             <w:vAlign w:val="center"/>
           </w:tcPr>
           <w:p>
@@ -169,7 +169,7 @@
         </w:tc>
         <w:tc>
           <w:tcPr>
-            <w:tcW w:w="7655" w:type="dxa"/>
+            <w:tcW w:w="3208" w:type="pct"/>
             <w:vAlign w:val="center"/>
           </w:tcPr>
           <w:p>
@@ -185,7 +185,7 @@
         </w:tc>
         <w:tc>
           <w:tcPr>
-            <w:tcW w:w="2097" w:type="dxa"/>
+            <w:tcW w:w="1455" w:type="pct"/>
             <w:vAlign w:val="center"/>
           </w:tcPr>
           <w:p>
@@ -206,7 +206,7 @@
         </w:trPr>
         <w:tc>
           <w:tcPr>
-            <w:tcW w:w="704" w:type="dxa"/>
+            <w:tcW w:w="337" w:type="pct"/>
             <w:vAlign w:val="center"/>
           </w:tcPr>
           <w:p>
@@ -230,7 +230,7 @@
         </w:tc>
         <w:tc>
           <w:tcPr>
-            <w:tcW w:w="7655" w:type="dxa"/>
+            <w:tcW w:w="3208" w:type="pct"/>
             <w:vAlign w:val="center"/>
           </w:tcPr>
           <w:p>
@@ -246,7 +246,7 @@
         </w:tc>
         <w:tc>
           <w:tcPr>
-            <w:tcW w:w="2097" w:type="dxa"/>
+            <w:tcW w:w="1455" w:type="pct"/>
             <w:vAlign w:val="center"/>
           </w:tcPr>
           <w:p>
@@ -267,7 +267,7 @@
         </w:trPr>
         <w:tc>
           <w:tcPr>
-            <w:tcW w:w="704" w:type="dxa"/>
+            <w:tcW w:w="337" w:type="pct"/>
             <w:vAlign w:val="center"/>
           </w:tcPr>
           <w:p>
@@ -291,7 +291,7 @@
         </w:tc>
         <w:tc>
           <w:tcPr>
-            <w:tcW w:w="7655" w:type="dxa"/>
+            <w:tcW w:w="3208" w:type="pct"/>
             <w:vAlign w:val="center"/>
           </w:tcPr>
           <w:p>
@@ -307,7 +307,7 @@
         </w:tc>
         <w:tc>
           <w:tcPr>
-            <w:tcW w:w="2097" w:type="dxa"/>
+            <w:tcW w:w="1455" w:type="pct"/>
             <w:vAlign w:val="center"/>
           </w:tcPr>
           <w:p>
@@ -335,9 +335,10 @@
     </w:p>
     <w:p/>
     <w:sectPr>
-      <w:pgSz w:w="11906" w:h="16838" w:code="9"/>
+      <w:pgSz w:w="16838" w:h="11906" w:orient="landscape" w:code="9"/>
       <w:pgMar w:top="720" w:right="720" w:bottom="720" w:left="720" w:header="709" w:footer="709" w:gutter="0"/>
       <w:cols w:space="708"/>
+      <w:vAlign w:val="center"/>
       <w:docGrid w:linePitch="360"/>
     </w:sectPr>
   </w:body>

</xml_diff>